<commit_message>
Correccion 02 - Termine Rosaschi
</commit_message>
<xml_diff>
--- a/Practicos/Notas y Devoluciones 02.docx
+++ b/Practicos/Notas y Devoluciones 02.docx
@@ -4,10 +4,12 @@
   <w:body>
     <w:p>
       <w:pPr>
-        <w:rPr>
-          <w:rFonts w:ascii="Segoe UI Emoji" w:hAnsi="Segoe UI Emoji" w:cs="Segoe UI Emoji"/>
-          <w:b/>
-          <w:bCs/>
+        <w:ind w:left="708" w:hanging="708"/>
+        <w:rPr>
+          <w:rFonts w:ascii="Segoe UI Emoji" w:hAnsi="Segoe UI Emoji" w:cs="Segoe UI Emoji"/>
+          <w:b/>
+          <w:bCs/>
+          <w:lang w:val="es-ES"/>
         </w:rPr>
       </w:pPr>
       <w:proofErr w:type="spellStart"/>
@@ -116,13 +118,7 @@
     <w:p/>
     <w:p>
       <w:r>
-        <w:t>Observaciones</w:t>
-      </w:r>
-      <w:r>
-        <w:t xml:space="preserve"> a tu trabajo son</w:t>
-      </w:r>
-      <w:r>
-        <w:t>:</w:t>
+        <w:t>Observaciones a tu trabajo son:</w:t>
       </w:r>
     </w:p>
     <w:p/>
@@ -519,25 +515,7 @@
       </w:r>
       <w:proofErr w:type="spellEnd"/>
       <w:r>
-        <w:t xml:space="preserve"> en algún texto para darle énfasis de manera que los motores de búsqueda lo tomen en cuenta, por ejemplo podías enfatizar </w:t>
-      </w:r>
-      <w:r>
-        <w:t>términos claves como</w:t>
-      </w:r>
-      <w:r>
-        <w:t xml:space="preserve"> “</w:t>
-      </w:r>
-      <w:r>
-        <w:t>MERN</w:t>
-      </w:r>
-      <w:r>
-        <w:t xml:space="preserve">” </w:t>
-      </w:r>
-      <w:r>
-        <w:t xml:space="preserve">o </w:t>
-      </w:r>
-      <w:r>
-        <w:t>“</w:t>
+        <w:t xml:space="preserve"> en algún texto para darle énfasis de manera que los motores de búsqueda lo tomen en cuenta, por ejemplo podías enfatizar términos claves como “MERN” o “</w:t>
       </w:r>
       <w:proofErr w:type="spellStart"/>
       <w:r>
@@ -545,10 +523,7 @@
       </w:r>
       <w:proofErr w:type="spellEnd"/>
       <w:r>
-        <w:t>”</w:t>
-      </w:r>
-      <w:r>
-        <w:t>.</w:t>
+        <w:t>”.</w:t>
       </w:r>
     </w:p>
     <w:p/>
@@ -1464,7 +1439,7 @@
         <w:t>🎉</w:t>
       </w:r>
       <w:r>
-        <w:t xml:space="preserve">¡Felicitaciones por la entrega del Desafío 01! </w:t>
+        <w:t xml:space="preserve">¡Felicitaciones por la entrega del Desafío 02! </w:t>
       </w:r>
       <w:r>
         <w:rPr>
@@ -1479,39 +1454,90 @@
         <w:t>Lautaro</w:t>
       </w:r>
       <w:r>
-        <w:t>, primeramente, quería felicitarte por el trabajo que realizaste. El resultado renderizado es el solicitado.</w:t>
-      </w:r>
-    </w:p>
-    <w:p/>
-    <w:p>
-      <w:r>
-        <w:t>C</w:t>
-      </w:r>
-      <w:r>
-        <w:t>orrecta estructura del documento HTML</w:t>
-      </w:r>
-      <w:r>
-        <w:t>, destaco la prolijidad del documento lo cual ayuda a mejorar la legibilidad del código.</w:t>
-      </w:r>
-    </w:p>
-    <w:p/>
-    <w:p>
-      <w:r>
-        <w:t>Respetaste el orden de aplicación de uso de etiquetas de encabezado (h1, h2, etc..) y el manejo de etiquetas para textos es correcto, esto es genial.</w:t>
-      </w:r>
-    </w:p>
-    <w:p/>
-    <w:p>
-      <w:r>
-        <w:t>Buenísimo que hayas diferenciado cuando usar etiquetas &lt;</w:t>
-      </w:r>
-      <w:proofErr w:type="spellStart"/>
-      <w:r>
-        <w:t>strong</w:t>
-      </w:r>
-      <w:proofErr w:type="spellEnd"/>
-      <w:r>
-        <w:t xml:space="preserve">&gt; y &lt;b&gt; </w:t>
+        <w:t>, excelente trabajo, el resultado es el que se solicitó en enunciado.</w:t>
+      </w:r>
+    </w:p>
+    <w:p/>
+    <w:p>
+      <w:r>
+        <w:t xml:space="preserve">La estructura HTML esta impecable, destaco la correcta implementación de contenedores semánticos como </w:t>
+      </w:r>
+      <w:proofErr w:type="spellStart"/>
+      <w:r>
+        <w:t>main</w:t>
+      </w:r>
+      <w:proofErr w:type="spellEnd"/>
+      <w:r>
+        <w:t xml:space="preserve">, </w:t>
+      </w:r>
+      <w:proofErr w:type="spellStart"/>
+      <w:r>
+        <w:t>section</w:t>
+      </w:r>
+      <w:proofErr w:type="spellEnd"/>
+      <w:r>
+        <w:t xml:space="preserve">, </w:t>
+      </w:r>
+      <w:proofErr w:type="spellStart"/>
+      <w:r>
+        <w:t>footer</w:t>
+      </w:r>
+      <w:proofErr w:type="spellEnd"/>
+      <w:r>
+        <w:t>, etc. El manejo de listas, textos y títulos es correcto.</w:t>
+      </w:r>
+    </w:p>
+    <w:p/>
+    <w:p>
+      <w:r>
+        <w:t xml:space="preserve">La manipulación de enlaces absolutos quedo perfecto. Genial que aplicaste </w:t>
+      </w:r>
+      <w:proofErr w:type="spellStart"/>
+      <w:r>
+        <w:t>pseudoclases</w:t>
+      </w:r>
+      <w:proofErr w:type="spellEnd"/>
+      <w:r>
+        <w:t xml:space="preserve"> para los enlaces.</w:t>
+      </w:r>
+      <w:r>
+        <w:t xml:space="preserve"> </w:t>
+      </w:r>
+    </w:p>
+    <w:p/>
+    <w:p>
+      <w:r>
+        <w:t xml:space="preserve">La vinculación de la página de estilos externa es correcta, </w:t>
+      </w:r>
+      <w:proofErr w:type="spellStart"/>
+      <w:r>
+        <w:t>buenisimo</w:t>
+      </w:r>
+      <w:proofErr w:type="spellEnd"/>
+      <w:r>
+        <w:t xml:space="preserve"> que usaste </w:t>
+      </w:r>
+      <w:proofErr w:type="spellStart"/>
+      <w:r>
+        <w:t>id’s</w:t>
+      </w:r>
+      <w:proofErr w:type="spellEnd"/>
+      <w:r>
+        <w:t>, quedo genial.</w:t>
+      </w:r>
+    </w:p>
+    <w:p/>
+    <w:p>
+      <w:r>
+        <w:t xml:space="preserve">Destaco que completaste los atributos </w:t>
+      </w:r>
+      <w:proofErr w:type="spellStart"/>
+      <w:r>
+        <w:t>alt</w:t>
+      </w:r>
+      <w:proofErr w:type="spellEnd"/>
+      <w:r>
+        <w:t xml:space="preserve"> de las imágenes, esto ayuda a mejorar la accesibilidad de sito web. </w:t>
       </w:r>
     </w:p>
     <w:p/>
@@ -1530,43 +1556,138 @@
           <w:numId w:val="3"/>
         </w:numPr>
       </w:pPr>
-      <w:proofErr w:type="spellStart"/>
-      <w:r>
-        <w:t>Recorda</w:t>
-      </w:r>
-      <w:proofErr w:type="spellEnd"/>
-      <w:r>
-        <w:t xml:space="preserve"> cambiar el lenguaje a español &lt;</w:t>
-      </w:r>
-      <w:proofErr w:type="spellStart"/>
-      <w:r>
-        <w:t>html</w:t>
-      </w:r>
-      <w:proofErr w:type="spellEnd"/>
-      <w:r>
-        <w:t xml:space="preserve"> </w:t>
-      </w:r>
-      <w:proofErr w:type="spellStart"/>
-      <w:r>
-        <w:t>lang</w:t>
-      </w:r>
-      <w:proofErr w:type="spellEnd"/>
-      <w:r>
-        <w:t>="es"&gt; porque esto le dice a los motores de búsqueda en que idioma esta tu sitio web.</w:t>
-      </w:r>
-    </w:p>
-    <w:p/>
-    <w:p/>
-    <w:p/>
-    <w:p>
-      <w:r>
-        <w:t>Excelente trabajo ¡</w:t>
-      </w:r>
-    </w:p>
-    <w:p/>
-    <w:p>
-      <w:r>
-        <w:t xml:space="preserve">Tu nota en el Desafío 01 es: </w:t>
+      <w:r>
+        <w:t xml:space="preserve">En la lista de Lugares Recomendados al hacer </w:t>
+      </w:r>
+      <w:proofErr w:type="spellStart"/>
+      <w:r>
+        <w:t>clicks</w:t>
+      </w:r>
+      <w:proofErr w:type="spellEnd"/>
+      <w:r>
+        <w:t xml:space="preserve"> sobre los títulos </w:t>
+      </w:r>
+      <w:proofErr w:type="spellStart"/>
+      <w:r>
+        <w:t>debian</w:t>
+      </w:r>
+      <w:proofErr w:type="spellEnd"/>
+      <w:r>
+        <w:t xml:space="preserve"> funcionar como anclas a las secciones correspondientes, por ejemplo:</w:t>
+      </w:r>
+    </w:p>
+    <w:p/>
+    <w:p>
+      <w:pPr>
+        <w:ind w:left="1416"/>
+      </w:pPr>
+      <w:r>
+        <w:t>&lt;</w:t>
+      </w:r>
+      <w:proofErr w:type="spellStart"/>
+      <w:r>
+        <w:t>li</w:t>
+      </w:r>
+      <w:proofErr w:type="spellEnd"/>
+      <w:r>
+        <w:t xml:space="preserve">&gt;&lt;a </w:t>
+      </w:r>
+      <w:proofErr w:type="spellStart"/>
+      <w:r>
+        <w:t>href</w:t>
+      </w:r>
+      <w:proofErr w:type="spellEnd"/>
+      <w:r>
+        <w:t>="#</w:t>
+      </w:r>
+      <w:proofErr w:type="spellStart"/>
+      <w:r>
+        <w:t>bariloche</w:t>
+      </w:r>
+      <w:proofErr w:type="spellEnd"/>
+      <w:r>
+        <w:t>"&gt;Bariloche, Argentina&lt;/a&gt;&lt;/</w:t>
+      </w:r>
+      <w:proofErr w:type="spellStart"/>
+      <w:r>
+        <w:t>li</w:t>
+      </w:r>
+      <w:proofErr w:type="spellEnd"/>
+      <w:r>
+        <w:t>&gt;</w:t>
+      </w:r>
+    </w:p>
+    <w:p>
+      <w:pPr>
+        <w:ind w:left="1416"/>
+      </w:pPr>
+      <w:r>
+        <w:t>………</w:t>
+      </w:r>
+    </w:p>
+    <w:p>
+      <w:pPr>
+        <w:ind w:left="1416"/>
+      </w:pPr>
+      <w:r>
+        <w:t>…..</w:t>
+      </w:r>
+    </w:p>
+    <w:p>
+      <w:pPr>
+        <w:ind w:left="1416"/>
+      </w:pPr>
+      <w:r>
+        <w:t>&lt;</w:t>
+      </w:r>
+      <w:proofErr w:type="spellStart"/>
+      <w:r>
+        <w:t>section</w:t>
+      </w:r>
+      <w:proofErr w:type="spellEnd"/>
+      <w:r>
+        <w:t xml:space="preserve"> id="</w:t>
+      </w:r>
+      <w:proofErr w:type="spellStart"/>
+      <w:r>
+        <w:t>bariloche</w:t>
+      </w:r>
+      <w:proofErr w:type="spellEnd"/>
+      <w:r>
+        <w:t xml:space="preserve">" </w:t>
+      </w:r>
+      <w:proofErr w:type="spellStart"/>
+      <w:r>
+        <w:t>class</w:t>
+      </w:r>
+      <w:proofErr w:type="spellEnd"/>
+      <w:r>
+        <w:t>="</w:t>
+      </w:r>
+      <w:proofErr w:type="spellStart"/>
+      <w:r>
+        <w:t>bariloche</w:t>
+      </w:r>
+      <w:proofErr w:type="spellEnd"/>
+      <w:r>
+        <w:t>"&gt;</w:t>
+      </w:r>
+    </w:p>
+    <w:p>
+      <w:pPr>
+        <w:ind w:left="1416"/>
+      </w:pPr>
+    </w:p>
+    <w:p/>
+    <w:p>
+      <w:r>
+        <w:t>Muy buen trabajo ¡</w:t>
+      </w:r>
+    </w:p>
+    <w:p/>
+    <w:p>
+      <w:r>
+        <w:t xml:space="preserve">Tu nota en el Desafío 02 es: </w:t>
       </w:r>
       <w:r>
         <w:rPr>
@@ -2228,7 +2349,6 @@
           <w:b/>
           <w:bCs/>
         </w:rPr>
-        <w:lastRenderedPageBreak/>
         <w:t>Tomas</w:t>
       </w:r>
       <w:r>
@@ -2700,6 +2820,7 @@
         <w:rPr>
           <w:rFonts w:ascii="Segoe UI Emoji" w:hAnsi="Segoe UI Emoji" w:cs="Segoe UI Emoji"/>
         </w:rPr>
+        <w:lastRenderedPageBreak/>
         <w:t>🎉</w:t>
       </w:r>
       <w:r>
@@ -2727,7 +2848,6 @@
     <w:p/>
     <w:p>
       <w:r>
-        <w:lastRenderedPageBreak/>
         <w:t>Destaco la correcta estructura del documento HTML, genial que hayas declarado el lenguaje del documento en español, estos pequeños detalles van sumando a facilitar la legibilidad del documento.</w:t>
       </w:r>
     </w:p>
@@ -2836,10 +2956,7 @@
     <w:p/>
     <w:p>
       <w:r>
-        <w:t>Tu nota en el Desafío 01 es:</w:t>
-      </w:r>
-      <w:r>
-        <w:t xml:space="preserve"> 9</w:t>
+        <w:t>Tu nota en el Desafío 01 es: 9</w:t>
       </w:r>
     </w:p>
     <w:p/>
@@ -2896,6 +3013,7 @@
         <w:rPr>
           <w:rFonts w:ascii="Segoe UI Emoji" w:hAnsi="Segoe UI Emoji" w:cs="Segoe UI Emoji"/>
         </w:rPr>
+        <w:lastRenderedPageBreak/>
         <w:t>🎉</w:t>
       </w:r>
       <w:r>
@@ -2931,7 +3049,6 @@
     <w:p/>
     <w:p>
       <w:r>
-        <w:lastRenderedPageBreak/>
         <w:t>Es correcta estructura del documento HTML. Respetaste el orden de aplicación de uso de etiquetas de encabezado (h1, h2, etc..) y el manejo de etiquetas para textos es correcto, eso es genial.</w:t>
       </w:r>
     </w:p>
@@ -3096,7 +3213,6 @@
     <w:p/>
     <w:p>
       <w:r>
-        <w:lastRenderedPageBreak/>
         <w:t xml:space="preserve">Respetaste el orden de aplicación de uso de etiquetas de encabezado (h1, h2, etc..) y el manejo de etiquetas para textos es correcto. </w:t>
       </w:r>
     </w:p>
@@ -3444,6 +3560,7 @@
     <w:p/>
     <w:p>
       <w:r>
+        <w:lastRenderedPageBreak/>
         <w:t>Buenísimo que aplicaste etiquetas &lt;b&gt; para resaltar en negrita textos, te falto aplicar palabras claves con etiquetas &lt;</w:t>
       </w:r>
       <w:proofErr w:type="spellStart"/>
@@ -4346,6 +4463,7 @@
     <w:p/>
     <w:p>
       <w:r>
+        <w:lastRenderedPageBreak/>
         <w:t>Observaciones a tu trabajo son:</w:t>
       </w:r>
     </w:p>
@@ -4402,7 +4520,6 @@
         </w:numPr>
       </w:pPr>
       <w:r>
-        <w:lastRenderedPageBreak/>
         <w:t xml:space="preserve">En la parte del significado del término FODA que la primer letra del </w:t>
       </w:r>
       <w:proofErr w:type="spellStart"/>
@@ -4798,7 +4915,7 @@
   <w:abstractNum w:abstractNumId="1" w15:restartNumberingAfterBreak="0">
     <w:nsid w:val="389741AE"/>
     <w:multiLevelType w:val="hybridMultilevel"/>
-    <w:tmpl w:val="1B2CAA30"/>
+    <w:tmpl w:val="CBF86CCE"/>
     <w:lvl w:ilvl="0" w:tplc="2C0A0001">
       <w:start w:val="1"/>
       <w:numFmt w:val="bullet"/>
@@ -5556,7 +5673,6 @@
   <w:style w:type="character" w:default="1" w:styleId="Fuentedeprrafopredeter">
     <w:name w:val="Default Paragraph Font"/>
     <w:uiPriority w:val="1"/>
-    <w:semiHidden/>
     <w:unhideWhenUsed/>
   </w:style>
   <w:style w:type="table" w:default="1" w:styleId="Tablanormal">

</xml_diff>